<commit_message>
Change Christopher Reid subheading
Co-Authored-By: Claude Sonnet 5.5 <noreply@anthropic.com>
</commit_message>
<xml_diff>
--- a/content-src/docx/R DT 2026 08 31 Christopher Reid.docx
+++ b/content-src/docx/R DT 2026 08 31 Christopher Reid.docx
@@ -26,10 +26,7 @@
         <w:t xml:space="preserve">&lt;subheading&gt; </w:t>
       </w:r>
       <w:r>
-        <w:t xml:space="preserve">After </w:t>
-      </w:r>
-      <w:r>
-        <w:t>50 years of writing poetry, Christopher Reid’s new collection, Ordinary Morning Sunlight, shows a writer at the height of his powers</w:t>
+        <w:t>Christopher Reid’s new collection, Ordinary Morning Sunlight, shows a writer at the height of his powers</w:t>
       </w:r>
       <w:r>
         <w:t>&lt;/subheading&gt;</w:t>

</xml_diff>